<commit_message>
add lower colontitul at reports
</commit_message>
<xml_diff>
--- a/db/lab_02/3311_arshin_bajmuhamedov_pasechny_db_lab02.docx
+++ b/db/lab_02/3311_arshin_bajmuhamedov_pasechny_db_lab02.docx
@@ -694,17 +694,35 @@
           <w:rFonts w:ascii="Times New Roman" w:hAnsi="Times New Roman" w:cs="Times New Roman"/>
           <w:sz w:val="28"/>
           <w:szCs w:val="28"/>
+          <w:lang w:val="ru-RU"/>
+        </w:rPr>
+      </w:pPr>
+      <w:r>
+        <w:rPr>
+          <w:rFonts w:ascii="Times New Roman" w:hAnsi="Times New Roman" w:cs="Times New Roman"/>
+          <w:sz w:val="28"/>
+          <w:szCs w:val="28"/>
+          <w:lang w:val="ru-RU"/>
+        </w:rPr>
+        <w:t xml:space="preserve">Знакомство с опциями </w:t>
+      </w:r>
+      <w:r>
+        <w:rPr>
+          <w:rFonts w:ascii="Times New Roman" w:hAnsi="Times New Roman" w:cs="Times New Roman"/>
+          <w:sz w:val="28"/>
+          <w:szCs w:val="28"/>
           <w:lang w:val="en-US"/>
         </w:rPr>
-      </w:pPr>
-      <w:r>
-        <w:rPr>
-          <w:rFonts w:ascii="Times New Roman" w:hAnsi="Times New Roman" w:cs="Times New Roman"/>
-          <w:sz w:val="28"/>
-          <w:szCs w:val="28"/>
-          <w:lang w:val="ru-RU"/>
-        </w:rPr>
-        <w:t xml:space="preserve">Знакомство с опциями </w:t>
+        <w:t>GROUP</w:t>
+      </w:r>
+      <w:r>
+        <w:rPr>
+          <w:rFonts w:ascii="Times New Roman" w:hAnsi="Times New Roman" w:cs="Times New Roman"/>
+          <w:sz w:val="28"/>
+          <w:szCs w:val="28"/>
+          <w:lang w:val="ru-RU"/>
+        </w:rPr>
+        <w:t xml:space="preserve"> </w:t>
       </w:r>
       <w:r>
         <w:rPr>
@@ -713,7 +731,43 @@
           <w:szCs w:val="28"/>
           <w:lang w:val="en-US"/>
         </w:rPr>
-        <w:t>GROUP</w:t>
+        <w:t>BY</w:t>
+      </w:r>
+      <w:r>
+        <w:rPr>
+          <w:rFonts w:ascii="Times New Roman" w:hAnsi="Times New Roman" w:cs="Times New Roman"/>
+          <w:sz w:val="28"/>
+          <w:szCs w:val="28"/>
+          <w:lang w:val="ru-RU"/>
+        </w:rPr>
+        <w:t xml:space="preserve"> и </w:t>
+      </w:r>
+      <w:r>
+        <w:rPr>
+          <w:rFonts w:ascii="Times New Roman" w:hAnsi="Times New Roman" w:cs="Times New Roman"/>
+          <w:sz w:val="28"/>
+          <w:szCs w:val="28"/>
+          <w:lang w:val="en-US"/>
+        </w:rPr>
+        <w:t>HAVING</w:t>
+      </w:r>
+      <w:r>
+        <w:rPr>
+          <w:rFonts w:ascii="Times New Roman" w:hAnsi="Times New Roman" w:cs="Times New Roman"/>
+          <w:sz w:val="28"/>
+          <w:szCs w:val="28"/>
+          <w:lang w:val="ru-RU"/>
+        </w:rPr>
+        <w:t xml:space="preserve">, а также агрегированием данных. В лабораторной работе используется база данных </w:t>
+      </w:r>
+      <w:r>
+        <w:rPr>
+          <w:rFonts w:ascii="Times New Roman" w:hAnsi="Times New Roman" w:cs="Times New Roman"/>
+          <w:sz w:val="28"/>
+          <w:szCs w:val="28"/>
+          <w:lang w:val="en-US"/>
+        </w:rPr>
+        <w:t>Adventure</w:t>
       </w:r>
       <w:r>
         <w:rPr>
@@ -731,43 +785,7 @@
           <w:szCs w:val="28"/>
           <w:lang w:val="en-US"/>
         </w:rPr>
-        <w:t>BY</w:t>
-      </w:r>
-      <w:r>
-        <w:rPr>
-          <w:rFonts w:ascii="Times New Roman" w:hAnsi="Times New Roman" w:cs="Times New Roman"/>
-          <w:sz w:val="28"/>
-          <w:szCs w:val="28"/>
-          <w:lang w:val="ru-RU"/>
-        </w:rPr>
-        <w:t xml:space="preserve"> и </w:t>
-      </w:r>
-      <w:r>
-        <w:rPr>
-          <w:rFonts w:ascii="Times New Roman" w:hAnsi="Times New Roman" w:cs="Times New Roman"/>
-          <w:sz w:val="28"/>
-          <w:szCs w:val="28"/>
-          <w:lang w:val="en-US"/>
-        </w:rPr>
-        <w:t>HAVING</w:t>
-      </w:r>
-      <w:r>
-        <w:rPr>
-          <w:rFonts w:ascii="Times New Roman" w:hAnsi="Times New Roman" w:cs="Times New Roman"/>
-          <w:sz w:val="28"/>
-          <w:szCs w:val="28"/>
-          <w:lang w:val="ru-RU"/>
-        </w:rPr>
-        <w:t xml:space="preserve">, а также агрегированием данных. В лабораторной работе используется база данных </w:t>
-      </w:r>
-      <w:r>
-        <w:rPr>
-          <w:rFonts w:ascii="Times New Roman" w:hAnsi="Times New Roman" w:cs="Times New Roman"/>
-          <w:sz w:val="28"/>
-          <w:szCs w:val="28"/>
-          <w:lang w:val="en-US"/>
-        </w:rPr>
-        <w:t>Adventure Works</w:t>
+        <w:t>Works</w:t>
       </w:r>
     </w:p>
     <w:p>
@@ -1048,7 +1066,16 @@
           <w:szCs w:val="28"/>
           <w:lang w:val="en-US"/>
         </w:rPr>
-        <w:t xml:space="preserve">Bonus </w:t>
+        <w:t>Bonus</w:t>
+      </w:r>
+      <w:r>
+        <w:rPr>
+          <w:rFonts w:ascii="Times New Roman" w:hAnsi="Times New Roman" w:cs="Times New Roman"/>
+          <w:sz w:val="28"/>
+          <w:szCs w:val="28"/>
+          <w:lang w:val="ru-RU"/>
+        </w:rPr>
+        <w:t xml:space="preserve"> </w:t>
       </w:r>
       <w:r>
         <w:rPr>
@@ -1098,7 +1125,7 @@
           <w:sz w:val="28"/>
           <w:szCs w:val="28"/>
           <w:highlight w:val="white"/>
-          <w:lang w:val="en-US" w:eastAsia="en-US"/>
+          <w:lang w:val="ru-RU" w:eastAsia="en-US"/>
           <w14:ligatures w14:val="standardContextual"/>
         </w:rPr>
       </w:pPr>
@@ -1121,7 +1148,7 @@
           <w:sz w:val="28"/>
           <w:szCs w:val="28"/>
           <w:highlight w:val="white"/>
-          <w:lang w:val="en-US" w:eastAsia="en-US"/>
+          <w:lang w:val="ru-RU" w:eastAsia="en-US"/>
           <w14:ligatures w14:val="standardContextual"/>
         </w:rPr>
         <w:t xml:space="preserve"> </w:t>
@@ -1147,7 +1174,7 @@
           <w:sz w:val="28"/>
           <w:szCs w:val="28"/>
           <w:highlight w:val="white"/>
-          <w:lang w:val="en-US" w:eastAsia="en-US"/>
+          <w:lang w:val="ru-RU" w:eastAsia="en-US"/>
           <w14:ligatures w14:val="standardContextual"/>
         </w:rPr>
         <w:t>,</w:t>
@@ -1159,10 +1186,22 @@
           <w:sz w:val="28"/>
           <w:szCs w:val="28"/>
           <w:highlight w:val="white"/>
-          <w:lang w:val="en-US" w:eastAsia="en-US"/>
-          <w14:ligatures w14:val="standardContextual"/>
-        </w:rPr>
-        <w:t xml:space="preserve"> Bonus</w:t>
+          <w:lang w:val="ru-RU" w:eastAsia="en-US"/>
+          <w14:ligatures w14:val="standardContextual"/>
+        </w:rPr>
+        <w:t xml:space="preserve"> </w:t>
+      </w:r>
+      <w:r>
+        <w:rPr>
+          <w:rFonts w:ascii="Times New Roman" w:eastAsiaTheme="minorHAnsi" w:hAnsi="Times New Roman" w:cs="Times New Roman"/>
+          <w:color w:val="000000"/>
+          <w:sz w:val="28"/>
+          <w:szCs w:val="28"/>
+          <w:highlight w:val="white"/>
+          <w:lang w:val="en-US" w:eastAsia="en-US"/>
+          <w14:ligatures w14:val="standardContextual"/>
+        </w:rPr>
+        <w:t>Bonus</w:t>
       </w:r>
     </w:p>
     <w:p>
@@ -1253,7 +1292,7 @@
           <w:rFonts w:ascii="Times New Roman" w:hAnsi="Times New Roman" w:cs="Times New Roman"/>
           <w:sz w:val="28"/>
           <w:szCs w:val="28"/>
-          <w:lang w:val="ru-RU"/>
+          <w:lang w:val="en-US"/>
         </w:rPr>
       </w:pPr>
       <w:r>
@@ -1263,7 +1302,7 @@
           <w:sz w:val="28"/>
           <w:szCs w:val="28"/>
           <w:highlight w:val="white"/>
-          <w:lang w:val="ru-RU" w:eastAsia="en-US"/>
+          <w:lang w:val="en-US" w:eastAsia="en-US"/>
           <w14:ligatures w14:val="standardContextual"/>
         </w:rPr>
         <w:t>ORDER</w:t>
@@ -1275,7 +1314,7 @@
           <w:sz w:val="28"/>
           <w:szCs w:val="28"/>
           <w:highlight w:val="white"/>
-          <w:lang w:val="ru-RU" w:eastAsia="en-US"/>
+          <w:lang w:val="en-US" w:eastAsia="en-US"/>
           <w14:ligatures w14:val="standardContextual"/>
         </w:rPr>
         <w:t xml:space="preserve"> </w:t>
@@ -1287,7 +1326,7 @@
           <w:sz w:val="28"/>
           <w:szCs w:val="28"/>
           <w:highlight w:val="white"/>
-          <w:lang w:val="ru-RU" w:eastAsia="en-US"/>
+          <w:lang w:val="en-US" w:eastAsia="en-US"/>
           <w14:ligatures w14:val="standardContextual"/>
         </w:rPr>
         <w:t>BY</w:t>
@@ -1299,36 +1338,10 @@
           <w:sz w:val="28"/>
           <w:szCs w:val="28"/>
           <w:highlight w:val="white"/>
-          <w:lang w:val="ru-RU" w:eastAsia="en-US"/>
-          <w14:ligatures w14:val="standardContextual"/>
-        </w:rPr>
-        <w:t xml:space="preserve"> </w:t>
-      </w:r>
-      <w:proofErr w:type="spellStart"/>
-      <w:r>
-        <w:rPr>
-          <w:rFonts w:ascii="Times New Roman" w:eastAsiaTheme="minorHAnsi" w:hAnsi="Times New Roman" w:cs="Times New Roman"/>
-          <w:color w:val="000000"/>
-          <w:sz w:val="28"/>
-          <w:szCs w:val="28"/>
-          <w:highlight w:val="white"/>
-          <w:lang w:val="ru-RU" w:eastAsia="en-US"/>
-          <w14:ligatures w14:val="standardContextual"/>
-        </w:rPr>
-        <w:t>Bonus</w:t>
-      </w:r>
-      <w:proofErr w:type="spellEnd"/>
-      <w:r>
-        <w:rPr>
-          <w:rFonts w:ascii="Times New Roman" w:eastAsiaTheme="minorHAnsi" w:hAnsi="Times New Roman" w:cs="Times New Roman"/>
-          <w:color w:val="000000"/>
-          <w:sz w:val="28"/>
-          <w:szCs w:val="28"/>
-          <w:highlight w:val="white"/>
-          <w:lang w:val="ru-RU" w:eastAsia="en-US"/>
-          <w14:ligatures w14:val="standardContextual"/>
-        </w:rPr>
-        <w:t xml:space="preserve"> </w:t>
+          <w:lang w:val="en-US" w:eastAsia="en-US"/>
+          <w14:ligatures w14:val="standardContextual"/>
+        </w:rPr>
+        <w:t xml:space="preserve"> Bonus </w:t>
       </w:r>
       <w:r>
         <w:rPr>
@@ -1337,7 +1350,7 @@
           <w:sz w:val="28"/>
           <w:szCs w:val="28"/>
           <w:highlight w:val="white"/>
-          <w:lang w:val="ru-RU" w:eastAsia="en-US"/>
+          <w:lang w:val="en-US" w:eastAsia="en-US"/>
           <w14:ligatures w14:val="standardContextual"/>
         </w:rPr>
         <w:t>DESC</w:t>
@@ -1850,7 +1863,7 @@
           <w:rFonts w:ascii="Times New Roman" w:hAnsi="Times New Roman" w:cs="Times New Roman"/>
           <w:sz w:val="28"/>
           <w:szCs w:val="28"/>
-          <w:lang w:val="en-US"/>
+          <w:lang w:val="ru-RU"/>
         </w:rPr>
       </w:pPr>
       <w:r>
@@ -1882,7 +1895,7 @@
           <w:iCs/>
           <w:sz w:val="28"/>
           <w:szCs w:val="28"/>
-          <w:lang w:val="ru-RU"/>
+          <w:lang w:val="en-US"/>
         </w:rPr>
       </w:pPr>
       <w:r>
@@ -2581,7 +2594,7 @@
           <w:rFonts w:ascii="Times New Roman" w:hAnsi="Times New Roman" w:cs="Times New Roman"/>
           <w:sz w:val="28"/>
           <w:szCs w:val="28"/>
-          <w:lang w:val="en-US"/>
+          <w:lang w:val="ru-RU"/>
         </w:rPr>
       </w:pPr>
       <w:r>
@@ -2672,7 +2685,7 @@
           <w:sz w:val="28"/>
           <w:szCs w:val="28"/>
           <w:highlight w:val="white"/>
-          <w:lang w:val="en-US" w:eastAsia="en-US"/>
+          <w:lang w:val="ru-RU" w:eastAsia="en-US"/>
           <w14:ligatures w14:val="standardContextual"/>
         </w:rPr>
       </w:pPr>
@@ -2695,7 +2708,7 @@
           <w:sz w:val="28"/>
           <w:szCs w:val="28"/>
           <w:highlight w:val="white"/>
-          <w:lang w:val="en-US" w:eastAsia="en-US"/>
+          <w:lang w:val="ru-RU" w:eastAsia="en-US"/>
           <w14:ligatures w14:val="standardContextual"/>
         </w:rPr>
         <w:t xml:space="preserve"> </w:t>
@@ -2719,7 +2732,7 @@
           <w:sz w:val="28"/>
           <w:szCs w:val="28"/>
           <w:highlight w:val="white"/>
-          <w:lang w:val="en-US" w:eastAsia="en-US"/>
+          <w:lang w:val="ru-RU" w:eastAsia="en-US"/>
           <w14:ligatures w14:val="standardContextual"/>
         </w:rPr>
         <w:t xml:space="preserve"> 4 </w:t>
@@ -2743,10 +2756,34 @@
           <w:sz w:val="28"/>
           <w:szCs w:val="28"/>
           <w:highlight w:val="white"/>
-          <w:lang w:val="en-US" w:eastAsia="en-US"/>
-          <w14:ligatures w14:val="standardContextual"/>
-        </w:rPr>
-        <w:t xml:space="preserve"> TIES </w:t>
+          <w:lang w:val="ru-RU" w:eastAsia="en-US"/>
+          <w14:ligatures w14:val="standardContextual"/>
+        </w:rPr>
+        <w:t xml:space="preserve"> </w:t>
+      </w:r>
+      <w:r>
+        <w:rPr>
+          <w:rFonts w:ascii="Times New Roman" w:eastAsiaTheme="minorHAnsi" w:hAnsi="Times New Roman" w:cs="Times New Roman"/>
+          <w:color w:val="000000"/>
+          <w:sz w:val="28"/>
+          <w:szCs w:val="28"/>
+          <w:highlight w:val="white"/>
+          <w:lang w:val="en-US" w:eastAsia="en-US"/>
+          <w14:ligatures w14:val="standardContextual"/>
+        </w:rPr>
+        <w:t>TIES</w:t>
+      </w:r>
+      <w:r>
+        <w:rPr>
+          <w:rFonts w:ascii="Times New Roman" w:eastAsiaTheme="minorHAnsi" w:hAnsi="Times New Roman" w:cs="Times New Roman"/>
+          <w:color w:val="000000"/>
+          <w:sz w:val="28"/>
+          <w:szCs w:val="28"/>
+          <w:highlight w:val="white"/>
+          <w:lang w:val="ru-RU" w:eastAsia="en-US"/>
+          <w14:ligatures w14:val="standardContextual"/>
+        </w:rPr>
+        <w:t xml:space="preserve"> </w:t>
       </w:r>
       <w:proofErr w:type="spellStart"/>
       <w:r>
@@ -2769,7 +2806,7 @@
           <w:sz w:val="28"/>
           <w:szCs w:val="28"/>
           <w:highlight w:val="white"/>
-          <w:lang w:val="en-US" w:eastAsia="en-US"/>
+          <w:lang w:val="ru-RU" w:eastAsia="en-US"/>
           <w14:ligatures w14:val="standardContextual"/>
         </w:rPr>
         <w:t>,</w:t>
@@ -2781,10 +2818,22 @@
           <w:sz w:val="28"/>
           <w:szCs w:val="28"/>
           <w:highlight w:val="white"/>
-          <w:lang w:val="en-US" w:eastAsia="en-US"/>
-          <w14:ligatures w14:val="standardContextual"/>
-        </w:rPr>
-        <w:t xml:space="preserve"> Bonus</w:t>
+          <w:lang w:val="ru-RU" w:eastAsia="en-US"/>
+          <w14:ligatures w14:val="standardContextual"/>
+        </w:rPr>
+        <w:t xml:space="preserve"> </w:t>
+      </w:r>
+      <w:r>
+        <w:rPr>
+          <w:rFonts w:ascii="Times New Roman" w:eastAsiaTheme="minorHAnsi" w:hAnsi="Times New Roman" w:cs="Times New Roman"/>
+          <w:color w:val="000000"/>
+          <w:sz w:val="28"/>
+          <w:szCs w:val="28"/>
+          <w:highlight w:val="white"/>
+          <w:lang w:val="en-US" w:eastAsia="en-US"/>
+          <w14:ligatures w14:val="standardContextual"/>
+        </w:rPr>
+        <w:t>Bonus</w:t>
       </w:r>
     </w:p>
     <w:p>
@@ -3552,7 +3601,7 @@
           <w:iCs/>
           <w:sz w:val="28"/>
           <w:szCs w:val="28"/>
-          <w:lang w:val="ru-RU"/>
+          <w:lang w:val="en-US"/>
         </w:rPr>
       </w:pPr>
       <w:r>
@@ -3608,6 +3657,7 @@
         </w:rPr>
         <w:t xml:space="preserve"> </w:t>
       </w:r>
+      <w:proofErr w:type="gramStart"/>
       <w:r>
         <w:rPr>
           <w:rFonts w:ascii="Times New Roman" w:eastAsiaTheme="minorHAnsi" w:hAnsi="Times New Roman" w:cs="Times New Roman"/>
@@ -3632,20 +3682,19 @@
         </w:rPr>
         <w:t>(</w:t>
       </w:r>
-      <w:proofErr w:type="spellStart"/>
-      <w:r>
-        <w:rPr>
-          <w:rFonts w:ascii="Times New Roman" w:eastAsiaTheme="minorHAnsi" w:hAnsi="Times New Roman" w:cs="Times New Roman"/>
-          <w:color w:val="000000"/>
-          <w:sz w:val="28"/>
-          <w:szCs w:val="28"/>
-          <w:highlight w:val="white"/>
-          <w:lang w:val="en-US" w:eastAsia="en-US"/>
-          <w14:ligatures w14:val="standardContextual"/>
-        </w:rPr>
-        <w:t>EmployeeID</w:t>
-      </w:r>
-      <w:proofErr w:type="spellEnd"/>
+      <w:proofErr w:type="gramEnd"/>
+      <w:r>
+        <w:rPr>
+          <w:rFonts w:ascii="Times New Roman" w:eastAsiaTheme="minorHAnsi" w:hAnsi="Times New Roman" w:cs="Times New Roman"/>
+          <w:color w:val="000000"/>
+          <w:sz w:val="28"/>
+          <w:szCs w:val="28"/>
+          <w:highlight w:val="white"/>
+          <w:lang w:val="en-US" w:eastAsia="en-US"/>
+          <w14:ligatures w14:val="standardContextual"/>
+        </w:rPr>
+        <w:t>*</w:t>
+      </w:r>
       <w:r>
         <w:rPr>
           <w:rFonts w:ascii="Times New Roman" w:eastAsiaTheme="minorHAnsi" w:hAnsi="Times New Roman" w:cs="Times New Roman"/>
@@ -4035,7 +4084,97 @@
           <w:szCs w:val="28"/>
           <w:lang w:val="ru-RU"/>
         </w:rPr>
-        <w:t>). Запрос выполняется по той же таблице</w:t>
+        <w:t>). Запрос</w:t>
+      </w:r>
+      <w:r>
+        <w:rPr>
+          <w:rFonts w:ascii="Times New Roman" w:hAnsi="Times New Roman" w:cs="Times New Roman"/>
+          <w:sz w:val="28"/>
+          <w:szCs w:val="28"/>
+          <w:lang w:val="en-US"/>
+        </w:rPr>
+        <w:t xml:space="preserve"> </w:t>
+      </w:r>
+      <w:r>
+        <w:rPr>
+          <w:rFonts w:ascii="Times New Roman" w:hAnsi="Times New Roman" w:cs="Times New Roman"/>
+          <w:sz w:val="28"/>
+          <w:szCs w:val="28"/>
+          <w:lang w:val="ru-RU"/>
+        </w:rPr>
+        <w:t>выполняется</w:t>
+      </w:r>
+      <w:r>
+        <w:rPr>
+          <w:rFonts w:ascii="Times New Roman" w:hAnsi="Times New Roman" w:cs="Times New Roman"/>
+          <w:sz w:val="28"/>
+          <w:szCs w:val="28"/>
+          <w:lang w:val="en-US"/>
+        </w:rPr>
+        <w:t xml:space="preserve"> </w:t>
+      </w:r>
+      <w:r>
+        <w:rPr>
+          <w:rFonts w:ascii="Times New Roman" w:hAnsi="Times New Roman" w:cs="Times New Roman"/>
+          <w:sz w:val="28"/>
+          <w:szCs w:val="28"/>
+          <w:lang w:val="ru-RU"/>
+        </w:rPr>
+        <w:t>по</w:t>
+      </w:r>
+      <w:r>
+        <w:rPr>
+          <w:rFonts w:ascii="Times New Roman" w:hAnsi="Times New Roman" w:cs="Times New Roman"/>
+          <w:sz w:val="28"/>
+          <w:szCs w:val="28"/>
+          <w:lang w:val="en-US"/>
+        </w:rPr>
+        <w:t xml:space="preserve"> </w:t>
+      </w:r>
+      <w:r>
+        <w:rPr>
+          <w:rFonts w:ascii="Times New Roman" w:hAnsi="Times New Roman" w:cs="Times New Roman"/>
+          <w:sz w:val="28"/>
+          <w:szCs w:val="28"/>
+          <w:lang w:val="ru-RU"/>
+        </w:rPr>
+        <w:t>той</w:t>
+      </w:r>
+      <w:r>
+        <w:rPr>
+          <w:rFonts w:ascii="Times New Roman" w:hAnsi="Times New Roman" w:cs="Times New Roman"/>
+          <w:sz w:val="28"/>
+          <w:szCs w:val="28"/>
+          <w:lang w:val="en-US"/>
+        </w:rPr>
+        <w:t xml:space="preserve"> </w:t>
+      </w:r>
+      <w:r>
+        <w:rPr>
+          <w:rFonts w:ascii="Times New Roman" w:hAnsi="Times New Roman" w:cs="Times New Roman"/>
+          <w:sz w:val="28"/>
+          <w:szCs w:val="28"/>
+          <w:lang w:val="ru-RU"/>
+        </w:rPr>
+        <w:t>же</w:t>
+      </w:r>
+      <w:r>
+        <w:rPr>
+          <w:rFonts w:ascii="Times New Roman" w:hAnsi="Times New Roman" w:cs="Times New Roman"/>
+          <w:sz w:val="28"/>
+          <w:szCs w:val="28"/>
+          <w:lang w:val="en-US"/>
+        </w:rPr>
+        <w:t xml:space="preserve"> </w:t>
+      </w:r>
+      <w:r>
+        <w:rPr>
+          <w:rFonts w:ascii="Times New Roman" w:hAnsi="Times New Roman" w:cs="Times New Roman"/>
+          <w:sz w:val="28"/>
+          <w:szCs w:val="28"/>
+          <w:lang w:val="ru-RU"/>
+        </w:rPr>
+        <w:t>таблице</w:t>
       </w:r>
     </w:p>
     <w:p>
@@ -4048,7 +4187,7 @@
           <w:iCs/>
           <w:sz w:val="28"/>
           <w:szCs w:val="28"/>
-          <w:lang w:val="ru-RU"/>
+          <w:lang w:val="en-US"/>
         </w:rPr>
       </w:pPr>
       <w:r>
@@ -4139,7 +4278,7 @@
           <w:lang w:val="en-US" w:eastAsia="en-US"/>
           <w14:ligatures w14:val="standardContextual"/>
         </w:rPr>
-        <w:t>EmployeeID</w:t>
+        <w:t>ManagerID</w:t>
       </w:r>
       <w:proofErr w:type="spellEnd"/>
       <w:r>
@@ -4289,133 +4428,11 @@
         <w:jc w:val="both"/>
         <w:rPr>
           <w:rFonts w:ascii="Times New Roman" w:hAnsi="Times New Roman" w:cs="Times New Roman"/>
-          <w:sz w:val="28"/>
-          <w:szCs w:val="28"/>
-          <w:lang w:val="en-US"/>
-        </w:rPr>
-      </w:pPr>
-      <w:r>
-        <w:rPr>
-          <w:rFonts w:ascii="Times New Roman" w:eastAsiaTheme="minorHAnsi" w:hAnsi="Times New Roman" w:cs="Times New Roman"/>
-          <w:color w:val="0000FF"/>
-          <w:sz w:val="28"/>
-          <w:szCs w:val="28"/>
-          <w:highlight w:val="white"/>
-          <w:lang w:val="en-US" w:eastAsia="en-US"/>
-          <w14:ligatures w14:val="standardContextual"/>
-        </w:rPr>
-        <w:t>WHERE</w:t>
-      </w:r>
-      <w:r>
-        <w:rPr>
-          <w:rFonts w:ascii="Times New Roman" w:eastAsiaTheme="minorHAnsi" w:hAnsi="Times New Roman" w:cs="Times New Roman"/>
-          <w:color w:val="000000"/>
-          <w:sz w:val="28"/>
-          <w:szCs w:val="28"/>
-          <w:highlight w:val="white"/>
-          <w:lang w:val="en-US" w:eastAsia="en-US"/>
-          <w14:ligatures w14:val="standardContextual"/>
-        </w:rPr>
-        <w:t xml:space="preserve"> </w:t>
-      </w:r>
-      <w:proofErr w:type="spellStart"/>
-      <w:r>
-        <w:rPr>
-          <w:rFonts w:ascii="Times New Roman" w:eastAsiaTheme="minorHAnsi" w:hAnsi="Times New Roman" w:cs="Times New Roman"/>
-          <w:color w:val="000000"/>
-          <w:sz w:val="28"/>
-          <w:szCs w:val="28"/>
-          <w:highlight w:val="white"/>
-          <w:lang w:val="en-US" w:eastAsia="en-US"/>
-          <w14:ligatures w14:val="standardContextual"/>
-        </w:rPr>
-        <w:t>ManagerID</w:t>
-      </w:r>
-      <w:proofErr w:type="spellEnd"/>
-      <w:r>
-        <w:rPr>
-          <w:rFonts w:ascii="Times New Roman" w:eastAsiaTheme="minorHAnsi" w:hAnsi="Times New Roman" w:cs="Times New Roman"/>
-          <w:color w:val="000000"/>
-          <w:sz w:val="28"/>
-          <w:szCs w:val="28"/>
-          <w:highlight w:val="white"/>
-          <w:lang w:val="en-US" w:eastAsia="en-US"/>
-          <w14:ligatures w14:val="standardContextual"/>
-        </w:rPr>
-        <w:t xml:space="preserve"> </w:t>
-      </w:r>
-      <w:r>
-        <w:rPr>
-          <w:rFonts w:ascii="Times New Roman" w:eastAsiaTheme="minorHAnsi" w:hAnsi="Times New Roman" w:cs="Times New Roman"/>
-          <w:color w:val="808080"/>
-          <w:sz w:val="28"/>
-          <w:szCs w:val="28"/>
-          <w:highlight w:val="white"/>
-          <w:lang w:val="en-US" w:eastAsia="en-US"/>
-          <w14:ligatures w14:val="standardContextual"/>
-        </w:rPr>
-        <w:t>IS</w:t>
-      </w:r>
-      <w:r>
-        <w:rPr>
-          <w:rFonts w:ascii="Times New Roman" w:eastAsiaTheme="minorHAnsi" w:hAnsi="Times New Roman" w:cs="Times New Roman"/>
-          <w:color w:val="000000"/>
-          <w:sz w:val="28"/>
-          <w:szCs w:val="28"/>
-          <w:highlight w:val="white"/>
-          <w:lang w:val="en-US" w:eastAsia="en-US"/>
-          <w14:ligatures w14:val="standardContextual"/>
-        </w:rPr>
-        <w:t xml:space="preserve"> </w:t>
-      </w:r>
-      <w:r>
-        <w:rPr>
-          <w:rFonts w:ascii="Times New Roman" w:eastAsiaTheme="minorHAnsi" w:hAnsi="Times New Roman" w:cs="Times New Roman"/>
-          <w:color w:val="808080"/>
-          <w:sz w:val="28"/>
-          <w:szCs w:val="28"/>
-          <w:highlight w:val="white"/>
-          <w:lang w:val="en-US" w:eastAsia="en-US"/>
-          <w14:ligatures w14:val="standardContextual"/>
-        </w:rPr>
-        <w:t>NOT</w:t>
-      </w:r>
-      <w:r>
-        <w:rPr>
-          <w:rFonts w:ascii="Times New Roman" w:eastAsiaTheme="minorHAnsi" w:hAnsi="Times New Roman" w:cs="Times New Roman"/>
-          <w:color w:val="000000"/>
-          <w:sz w:val="28"/>
-          <w:szCs w:val="28"/>
-          <w:highlight w:val="white"/>
-          <w:lang w:val="en-US" w:eastAsia="en-US"/>
-          <w14:ligatures w14:val="standardContextual"/>
-        </w:rPr>
-        <w:t xml:space="preserve"> </w:t>
-      </w:r>
-      <w:r>
-        <w:rPr>
-          <w:rFonts w:ascii="Times New Roman" w:eastAsiaTheme="minorHAnsi" w:hAnsi="Times New Roman" w:cs="Times New Roman"/>
-          <w:color w:val="808080"/>
-          <w:sz w:val="28"/>
-          <w:szCs w:val="28"/>
-          <w:highlight w:val="white"/>
-          <w:lang w:val="en-US" w:eastAsia="en-US"/>
-          <w14:ligatures w14:val="standardContextual"/>
-        </w:rPr>
-        <w:t>NULL</w:t>
-      </w:r>
-    </w:p>
-    <w:p>
-      <w:pPr>
-        <w:spacing w:line="360" w:lineRule="auto"/>
-        <w:jc w:val="both"/>
-        <w:rPr>
-          <w:rFonts w:ascii="Times New Roman" w:hAnsi="Times New Roman" w:cs="Times New Roman"/>
           <w:i/>
           <w:iCs/>
           <w:sz w:val="28"/>
           <w:szCs w:val="28"/>
-          <w:lang w:val="ru-RU"/>
+          <w:lang w:val="en-US"/>
         </w:rPr>
       </w:pPr>
       <w:r>
@@ -4577,7 +4594,6 @@
           <w:szCs w:val="28"/>
           <w:lang w:val="ru-RU"/>
         </w:rPr>
-        <w:lastRenderedPageBreak/>
         <w:t>Время выполнения: 2025-09-15T21:55:11.9958702+03:00</w:t>
       </w:r>
     </w:p>
@@ -4776,7 +4792,7 @@
           <w:iCs/>
           <w:sz w:val="28"/>
           <w:szCs w:val="28"/>
-          <w:lang w:val="ru-RU"/>
+          <w:lang w:val="en-US"/>
         </w:rPr>
       </w:pPr>
       <w:r>
@@ -5664,7 +5680,7 @@
           <w:iCs/>
           <w:sz w:val="28"/>
           <w:szCs w:val="28"/>
-          <w:lang w:val="ru-RU"/>
+          <w:lang w:val="en-US"/>
         </w:rPr>
       </w:pPr>
       <w:r>
@@ -6025,7 +6041,7 @@
           <w:rFonts w:ascii="Times New Roman" w:hAnsi="Times New Roman" w:cs="Times New Roman"/>
           <w:sz w:val="28"/>
           <w:szCs w:val="28"/>
-          <w:lang w:val="ru-RU"/>
+          <w:lang w:val="en-US"/>
         </w:rPr>
       </w:pPr>
       <w:r>
@@ -6035,7 +6051,7 @@
           <w:sz w:val="28"/>
           <w:szCs w:val="28"/>
           <w:highlight w:val="white"/>
-          <w:lang w:val="ru-RU" w:eastAsia="en-US"/>
+          <w:lang w:val="en-US" w:eastAsia="en-US"/>
           <w14:ligatures w14:val="standardContextual"/>
         </w:rPr>
         <w:t>ORDER</w:t>
@@ -6047,7 +6063,7 @@
           <w:sz w:val="28"/>
           <w:szCs w:val="28"/>
           <w:highlight w:val="white"/>
-          <w:lang w:val="ru-RU" w:eastAsia="en-US"/>
+          <w:lang w:val="en-US" w:eastAsia="en-US"/>
           <w14:ligatures w14:val="standardContextual"/>
         </w:rPr>
         <w:t xml:space="preserve"> </w:t>
@@ -6059,7 +6075,7 @@
           <w:sz w:val="28"/>
           <w:szCs w:val="28"/>
           <w:highlight w:val="white"/>
-          <w:lang w:val="ru-RU" w:eastAsia="en-US"/>
+          <w:lang w:val="en-US" w:eastAsia="en-US"/>
           <w14:ligatures w14:val="standardContextual"/>
         </w:rPr>
         <w:t>BY</w:t>
@@ -6071,36 +6087,10 @@
           <w:sz w:val="28"/>
           <w:szCs w:val="28"/>
           <w:highlight w:val="white"/>
-          <w:lang w:val="ru-RU" w:eastAsia="en-US"/>
-          <w14:ligatures w14:val="standardContextual"/>
-        </w:rPr>
-        <w:t xml:space="preserve"> [Product </w:t>
-      </w:r>
-      <w:proofErr w:type="spellStart"/>
-      <w:r>
-        <w:rPr>
-          <w:rFonts w:ascii="Times New Roman" w:eastAsiaTheme="minorHAnsi" w:hAnsi="Times New Roman" w:cs="Times New Roman"/>
-          <w:color w:val="000000"/>
-          <w:sz w:val="28"/>
-          <w:szCs w:val="28"/>
-          <w:highlight w:val="white"/>
-          <w:lang w:val="ru-RU" w:eastAsia="en-US"/>
-          <w14:ligatures w14:val="standardContextual"/>
-        </w:rPr>
-        <w:t>quantity</w:t>
-      </w:r>
-      <w:proofErr w:type="spellEnd"/>
-      <w:r>
-        <w:rPr>
-          <w:rFonts w:ascii="Times New Roman" w:eastAsiaTheme="minorHAnsi" w:hAnsi="Times New Roman" w:cs="Times New Roman"/>
-          <w:color w:val="000000"/>
-          <w:sz w:val="28"/>
-          <w:szCs w:val="28"/>
-          <w:highlight w:val="white"/>
-          <w:lang w:val="ru-RU" w:eastAsia="en-US"/>
-          <w14:ligatures w14:val="standardContextual"/>
-        </w:rPr>
-        <w:t xml:space="preserve">] </w:t>
+          <w:lang w:val="en-US" w:eastAsia="en-US"/>
+          <w14:ligatures w14:val="standardContextual"/>
+        </w:rPr>
+        <w:t xml:space="preserve"> [Product quantity] </w:t>
       </w:r>
       <w:r>
         <w:rPr>
@@ -6109,7 +6099,7 @@
           <w:sz w:val="28"/>
           <w:szCs w:val="28"/>
           <w:highlight w:val="white"/>
-          <w:lang w:val="ru-RU" w:eastAsia="en-US"/>
+          <w:lang w:val="en-US" w:eastAsia="en-US"/>
           <w14:ligatures w14:val="standardContextual"/>
         </w:rPr>
         <w:t>DESC</w:t>
@@ -6174,7 +6164,6 @@
                 <w:szCs w:val="28"/>
                 <w:lang w:val="en-US"/>
               </w:rPr>
-              <w:lastRenderedPageBreak/>
               <w:t>ProductID</w:t>
             </w:r>
             <w:proofErr w:type="spellEnd"/>
@@ -6230,6 +6219,7 @@
                 <w:szCs w:val="28"/>
                 <w:lang w:val="en-US"/>
               </w:rPr>
+              <w:lastRenderedPageBreak/>
               <w:t>712</w:t>
             </w:r>
           </w:p>
@@ -6636,7 +6626,7 @@
           <w:rFonts w:ascii="Times New Roman" w:hAnsi="Times New Roman" w:cs="Times New Roman"/>
           <w:sz w:val="28"/>
           <w:szCs w:val="28"/>
-          <w:lang w:val="en-US"/>
+          <w:lang w:val="ru-RU"/>
         </w:rPr>
       </w:pPr>
       <w:r>
@@ -6659,7 +6649,7 @@
           <w:iCs/>
           <w:sz w:val="28"/>
           <w:szCs w:val="28"/>
-          <w:lang w:val="ru-RU"/>
+          <w:lang w:val="en-US"/>
         </w:rPr>
       </w:pPr>
       <w:r>
@@ -7148,7 +7138,7 @@
           <w:rFonts w:ascii="Times New Roman" w:hAnsi="Times New Roman" w:cs="Times New Roman"/>
           <w:sz w:val="28"/>
           <w:szCs w:val="28"/>
-          <w:lang w:val="ru-RU"/>
+          <w:lang w:val="en-US"/>
         </w:rPr>
       </w:pPr>
       <w:r>
@@ -7719,6 +7709,7 @@
           <w:szCs w:val="28"/>
           <w:lang w:val="ru-RU"/>
         </w:rPr>
+        <w:lastRenderedPageBreak/>
         <w:t>Задание 2.3.1</w:t>
       </w:r>
       <w:r>
@@ -7743,7 +7734,7 @@
           <w:rFonts w:ascii="Times New Roman" w:hAnsi="Times New Roman" w:cs="Times New Roman"/>
           <w:sz w:val="28"/>
           <w:szCs w:val="28"/>
-          <w:lang w:val="ru-RU"/>
+          <w:lang w:val="en-US"/>
         </w:rPr>
       </w:pPr>
       <w:r>
@@ -7981,16 +7972,43 @@
           <w:szCs w:val="28"/>
           <w:lang w:val="ru-RU"/>
         </w:rPr>
-        <w:t>Выполним группировк</w:t>
-      </w:r>
-      <w:r>
-        <w:rPr>
-          <w:rFonts w:ascii="Times New Roman" w:hAnsi="Times New Roman" w:cs="Times New Roman"/>
-          <w:sz w:val="28"/>
-          <w:szCs w:val="28"/>
-          <w:lang w:val="ru-RU"/>
-        </w:rPr>
-        <w:t>у.</w:t>
+        <w:t>Выполним</w:t>
+      </w:r>
+      <w:r>
+        <w:rPr>
+          <w:rFonts w:ascii="Times New Roman" w:hAnsi="Times New Roman" w:cs="Times New Roman"/>
+          <w:sz w:val="28"/>
+          <w:szCs w:val="28"/>
+          <w:lang w:val="en-US"/>
+        </w:rPr>
+        <w:t xml:space="preserve"> </w:t>
+      </w:r>
+      <w:r>
+        <w:rPr>
+          <w:rFonts w:ascii="Times New Roman" w:hAnsi="Times New Roman" w:cs="Times New Roman"/>
+          <w:sz w:val="28"/>
+          <w:szCs w:val="28"/>
+          <w:lang w:val="ru-RU"/>
+        </w:rPr>
+        <w:t>группировк</w:t>
+      </w:r>
+      <w:r>
+        <w:rPr>
+          <w:rFonts w:ascii="Times New Roman" w:hAnsi="Times New Roman" w:cs="Times New Roman"/>
+          <w:sz w:val="28"/>
+          <w:szCs w:val="28"/>
+          <w:lang w:val="ru-RU"/>
+        </w:rPr>
+        <w:t>у</w:t>
+      </w:r>
+      <w:r>
+        <w:rPr>
+          <w:rFonts w:ascii="Times New Roman" w:hAnsi="Times New Roman" w:cs="Times New Roman"/>
+          <w:sz w:val="28"/>
+          <w:szCs w:val="28"/>
+          <w:lang w:val="en-US"/>
+        </w:rPr>
+        <w:t>.</w:t>
       </w:r>
     </w:p>
     <w:p>
@@ -8003,7 +8021,7 @@
           <w:iCs/>
           <w:sz w:val="28"/>
           <w:szCs w:val="28"/>
-          <w:lang w:val="ru-RU"/>
+          <w:lang w:val="en-US"/>
         </w:rPr>
       </w:pPr>
       <w:r>
@@ -9719,45 +9737,45 @@
           <w:rFonts w:ascii="Times New Roman" w:hAnsi="Times New Roman" w:cs="Times New Roman"/>
           <w:sz w:val="28"/>
           <w:szCs w:val="28"/>
+          <w:lang w:val="ru-RU"/>
+        </w:rPr>
+        <w:t xml:space="preserve">. </w:t>
+      </w:r>
+      <w:r>
+        <w:rPr>
+          <w:rFonts w:ascii="Times New Roman" w:hAnsi="Times New Roman" w:cs="Times New Roman"/>
+          <w:sz w:val="28"/>
+          <w:szCs w:val="28"/>
+          <w:lang w:val="ru-RU"/>
+        </w:rPr>
+        <w:t>Выполним группировку. Да</w:t>
+      </w:r>
+      <w:r>
+        <w:rPr>
+          <w:rFonts w:ascii="Times New Roman" w:hAnsi="Times New Roman" w:cs="Times New Roman"/>
+          <w:sz w:val="28"/>
+          <w:szCs w:val="28"/>
+          <w:lang w:val="ru-RU"/>
+        </w:rPr>
+        <w:t>дим</w:t>
+      </w:r>
+      <w:r>
+        <w:rPr>
+          <w:rFonts w:ascii="Times New Roman" w:hAnsi="Times New Roman" w:cs="Times New Roman"/>
+          <w:sz w:val="28"/>
+          <w:szCs w:val="28"/>
+          <w:lang w:val="ru-RU"/>
+        </w:rPr>
+        <w:t xml:space="preserve"> псевдоним </w:t>
+      </w:r>
+      <w:proofErr w:type="spellStart"/>
+      <w:r>
+        <w:rPr>
+          <w:rFonts w:ascii="Times New Roman" w:hAnsi="Times New Roman" w:cs="Times New Roman"/>
+          <w:sz w:val="28"/>
+          <w:szCs w:val="28"/>
           <w:lang w:val="en-US"/>
         </w:rPr>
-        <w:t xml:space="preserve">. </w:t>
-      </w:r>
-      <w:r>
-        <w:rPr>
-          <w:rFonts w:ascii="Times New Roman" w:hAnsi="Times New Roman" w:cs="Times New Roman"/>
-          <w:sz w:val="28"/>
-          <w:szCs w:val="28"/>
-          <w:lang w:val="ru-RU"/>
-        </w:rPr>
-        <w:t>Выполним группировку. Да</w:t>
-      </w:r>
-      <w:r>
-        <w:rPr>
-          <w:rFonts w:ascii="Times New Roman" w:hAnsi="Times New Roman" w:cs="Times New Roman"/>
-          <w:sz w:val="28"/>
-          <w:szCs w:val="28"/>
-          <w:lang w:val="ru-RU"/>
-        </w:rPr>
-        <w:t>дим</w:t>
-      </w:r>
-      <w:r>
-        <w:rPr>
-          <w:rFonts w:ascii="Times New Roman" w:hAnsi="Times New Roman" w:cs="Times New Roman"/>
-          <w:sz w:val="28"/>
-          <w:szCs w:val="28"/>
-          <w:lang w:val="ru-RU"/>
-        </w:rPr>
-        <w:t xml:space="preserve"> псевдоним </w:t>
-      </w:r>
-      <w:proofErr w:type="spellStart"/>
-      <w:r>
-        <w:rPr>
-          <w:rFonts w:ascii="Times New Roman" w:hAnsi="Times New Roman" w:cs="Times New Roman"/>
-          <w:sz w:val="28"/>
-          <w:szCs w:val="28"/>
-          <w:lang w:val="en-US"/>
-        </w:rPr>
         <w:t>TotalSalesYTD</w:t>
       </w:r>
       <w:proofErr w:type="spellEnd"/>
@@ -9766,7 +9784,7 @@
           <w:rFonts w:ascii="Times New Roman" w:hAnsi="Times New Roman" w:cs="Times New Roman"/>
           <w:sz w:val="28"/>
           <w:szCs w:val="28"/>
-          <w:lang w:val="en-US"/>
+          <w:lang w:val="ru-RU"/>
         </w:rPr>
         <w:t xml:space="preserve"> </w:t>
       </w:r>
@@ -9818,7 +9836,7 @@
           <w:sz w:val="28"/>
           <w:szCs w:val="28"/>
           <w:highlight w:val="white"/>
-          <w:lang w:val="en-US" w:eastAsia="en-US"/>
+          <w:lang w:val="ru-RU" w:eastAsia="en-US"/>
           <w14:ligatures w14:val="standardContextual"/>
         </w:rPr>
       </w:pPr>
@@ -9841,7 +9859,7 @@
           <w:sz w:val="28"/>
           <w:szCs w:val="28"/>
           <w:highlight w:val="white"/>
-          <w:lang w:val="en-US" w:eastAsia="en-US"/>
+          <w:lang w:val="ru-RU" w:eastAsia="en-US"/>
           <w14:ligatures w14:val="standardContextual"/>
         </w:rPr>
         <w:t xml:space="preserve"> </w:t>
@@ -9867,7 +9885,7 @@
           <w:sz w:val="28"/>
           <w:szCs w:val="28"/>
           <w:highlight w:val="white"/>
-          <w:lang w:val="en-US" w:eastAsia="en-US"/>
+          <w:lang w:val="ru-RU" w:eastAsia="en-US"/>
           <w14:ligatures w14:val="standardContextual"/>
         </w:rPr>
         <w:t>,</w:t>
@@ -9879,7 +9897,7 @@
           <w:sz w:val="28"/>
           <w:szCs w:val="28"/>
           <w:highlight w:val="white"/>
-          <w:lang w:val="en-US" w:eastAsia="en-US"/>
+          <w:lang w:val="ru-RU" w:eastAsia="en-US"/>
           <w14:ligatures w14:val="standardContextual"/>
         </w:rPr>
         <w:t xml:space="preserve"> </w:t>
@@ -9903,7 +9921,7 @@
           <w:sz w:val="28"/>
           <w:szCs w:val="28"/>
           <w:highlight w:val="white"/>
-          <w:lang w:val="en-US" w:eastAsia="en-US"/>
+          <w:lang w:val="ru-RU" w:eastAsia="en-US"/>
           <w14:ligatures w14:val="standardContextual"/>
         </w:rPr>
         <w:t>(</w:t>
@@ -9929,7 +9947,7 @@
           <w:sz w:val="28"/>
           <w:szCs w:val="28"/>
           <w:highlight w:val="white"/>
-          <w:lang w:val="en-US" w:eastAsia="en-US"/>
+          <w:lang w:val="ru-RU" w:eastAsia="en-US"/>
           <w14:ligatures w14:val="standardContextual"/>
         </w:rPr>
         <w:t>)</w:t>
@@ -9941,7 +9959,7 @@
           <w:sz w:val="28"/>
           <w:szCs w:val="28"/>
           <w:highlight w:val="white"/>
-          <w:lang w:val="en-US" w:eastAsia="en-US"/>
+          <w:lang w:val="ru-RU" w:eastAsia="en-US"/>
           <w14:ligatures w14:val="standardContextual"/>
         </w:rPr>
         <w:t xml:space="preserve"> </w:t>
@@ -9965,7 +9983,7 @@
           <w:sz w:val="28"/>
           <w:szCs w:val="28"/>
           <w:highlight w:val="white"/>
-          <w:lang w:val="en-US" w:eastAsia="en-US"/>
+          <w:lang w:val="ru-RU" w:eastAsia="en-US"/>
           <w14:ligatures w14:val="standardContextual"/>
         </w:rPr>
         <w:t xml:space="preserve"> </w:t>
@@ -9977,10 +9995,82 @@
           <w:sz w:val="28"/>
           <w:szCs w:val="28"/>
           <w:highlight w:val="white"/>
-          <w:lang w:val="en-US" w:eastAsia="en-US"/>
-          <w14:ligatures w14:val="standardContextual"/>
-        </w:rPr>
-        <w:t>'sum of sales'</w:t>
+          <w:lang w:val="ru-RU" w:eastAsia="en-US"/>
+          <w14:ligatures w14:val="standardContextual"/>
+        </w:rPr>
+        <w:t>'</w:t>
+      </w:r>
+      <w:r>
+        <w:rPr>
+          <w:rFonts w:ascii="Times New Roman" w:eastAsiaTheme="minorHAnsi" w:hAnsi="Times New Roman" w:cs="Times New Roman"/>
+          <w:color w:val="FF0000"/>
+          <w:sz w:val="28"/>
+          <w:szCs w:val="28"/>
+          <w:highlight w:val="white"/>
+          <w:lang w:val="en-US" w:eastAsia="en-US"/>
+          <w14:ligatures w14:val="standardContextual"/>
+        </w:rPr>
+        <w:t>sum</w:t>
+      </w:r>
+      <w:r>
+        <w:rPr>
+          <w:rFonts w:ascii="Times New Roman" w:eastAsiaTheme="minorHAnsi" w:hAnsi="Times New Roman" w:cs="Times New Roman"/>
+          <w:color w:val="FF0000"/>
+          <w:sz w:val="28"/>
+          <w:szCs w:val="28"/>
+          <w:highlight w:val="white"/>
+          <w:lang w:val="ru-RU" w:eastAsia="en-US"/>
+          <w14:ligatures w14:val="standardContextual"/>
+        </w:rPr>
+        <w:t xml:space="preserve"> </w:t>
+      </w:r>
+      <w:r>
+        <w:rPr>
+          <w:rFonts w:ascii="Times New Roman" w:eastAsiaTheme="minorHAnsi" w:hAnsi="Times New Roman" w:cs="Times New Roman"/>
+          <w:color w:val="FF0000"/>
+          <w:sz w:val="28"/>
+          <w:szCs w:val="28"/>
+          <w:highlight w:val="white"/>
+          <w:lang w:val="en-US" w:eastAsia="en-US"/>
+          <w14:ligatures w14:val="standardContextual"/>
+        </w:rPr>
+        <w:t>of</w:t>
+      </w:r>
+      <w:r>
+        <w:rPr>
+          <w:rFonts w:ascii="Times New Roman" w:eastAsiaTheme="minorHAnsi" w:hAnsi="Times New Roman" w:cs="Times New Roman"/>
+          <w:color w:val="FF0000"/>
+          <w:sz w:val="28"/>
+          <w:szCs w:val="28"/>
+          <w:highlight w:val="white"/>
+          <w:lang w:val="ru-RU" w:eastAsia="en-US"/>
+          <w14:ligatures w14:val="standardContextual"/>
+        </w:rPr>
+        <w:t xml:space="preserve"> </w:t>
+      </w:r>
+      <w:r>
+        <w:rPr>
+          <w:rFonts w:ascii="Times New Roman" w:eastAsiaTheme="minorHAnsi" w:hAnsi="Times New Roman" w:cs="Times New Roman"/>
+          <w:color w:val="FF0000"/>
+          <w:sz w:val="28"/>
+          <w:szCs w:val="28"/>
+          <w:highlight w:val="white"/>
+          <w:lang w:val="en-US" w:eastAsia="en-US"/>
+          <w14:ligatures w14:val="standardContextual"/>
+        </w:rPr>
+        <w:t>sales</w:t>
+      </w:r>
+      <w:r>
+        <w:rPr>
+          <w:rFonts w:ascii="Times New Roman" w:eastAsiaTheme="minorHAnsi" w:hAnsi="Times New Roman" w:cs="Times New Roman"/>
+          <w:color w:val="FF0000"/>
+          <w:sz w:val="28"/>
+          <w:szCs w:val="28"/>
+          <w:highlight w:val="white"/>
+          <w:lang w:val="ru-RU" w:eastAsia="en-US"/>
+          <w14:ligatures w14:val="standardContextual"/>
+        </w:rPr>
+        <w:t>'</w:t>
       </w:r>
     </w:p>
     <w:p>
@@ -10492,7 +10582,52 @@
           <w:szCs w:val="28"/>
           <w:lang w:val="ru-RU"/>
         </w:rPr>
-        <w:t xml:space="preserve">Изменим запрос так, чтобы получать сводный результат по полученной выборке. Дополнительно применим функцию </w:t>
+        <w:t>Изменим запрос так, чтобы получать сводный результат по полученной выборке. Дополнительно</w:t>
+      </w:r>
+      <w:r>
+        <w:rPr>
+          <w:rFonts w:ascii="Times New Roman" w:hAnsi="Times New Roman" w:cs="Times New Roman"/>
+          <w:sz w:val="28"/>
+          <w:szCs w:val="28"/>
+          <w:lang w:val="en-US"/>
+        </w:rPr>
+        <w:t xml:space="preserve"> </w:t>
+      </w:r>
+      <w:r>
+        <w:rPr>
+          <w:rFonts w:ascii="Times New Roman" w:hAnsi="Times New Roman" w:cs="Times New Roman"/>
+          <w:sz w:val="28"/>
+          <w:szCs w:val="28"/>
+          <w:lang w:val="ru-RU"/>
+        </w:rPr>
+        <w:t>применим</w:t>
+      </w:r>
+      <w:r>
+        <w:rPr>
+          <w:rFonts w:ascii="Times New Roman" w:hAnsi="Times New Roman" w:cs="Times New Roman"/>
+          <w:sz w:val="28"/>
+          <w:szCs w:val="28"/>
+          <w:lang w:val="en-US"/>
+        </w:rPr>
+        <w:t xml:space="preserve"> </w:t>
+      </w:r>
+      <w:r>
+        <w:rPr>
+          <w:rFonts w:ascii="Times New Roman" w:hAnsi="Times New Roman" w:cs="Times New Roman"/>
+          <w:sz w:val="28"/>
+          <w:szCs w:val="28"/>
+          <w:lang w:val="ru-RU"/>
+        </w:rPr>
+        <w:t>функцию</w:t>
+      </w:r>
+      <w:r>
+        <w:rPr>
+          <w:rFonts w:ascii="Times New Roman" w:hAnsi="Times New Roman" w:cs="Times New Roman"/>
+          <w:sz w:val="28"/>
+          <w:szCs w:val="28"/>
+          <w:lang w:val="en-US"/>
+        </w:rPr>
+        <w:t xml:space="preserve"> </w:t>
       </w:r>
       <w:r>
         <w:rPr>
@@ -10514,7 +10649,7 @@
           <w:iCs/>
           <w:sz w:val="28"/>
           <w:szCs w:val="28"/>
-          <w:lang w:val="ru-RU"/>
+          <w:lang w:val="en-US"/>
         </w:rPr>
       </w:pPr>
       <w:r>
@@ -11879,7 +12014,7 @@
           <w:iCs/>
           <w:sz w:val="28"/>
           <w:szCs w:val="28"/>
-          <w:lang w:val="ru-RU"/>
+          <w:lang w:val="en-US"/>
         </w:rPr>
       </w:pPr>
       <w:r>
@@ -12929,7 +13064,7 @@
           <w:rFonts w:ascii="Times New Roman" w:hAnsi="Times New Roman" w:cs="Times New Roman"/>
           <w:sz w:val="28"/>
           <w:szCs w:val="28"/>
-          <w:lang w:val="en-US"/>
+          <w:lang w:val="ru-RU"/>
         </w:rPr>
       </w:pPr>
       <w:r>
@@ -12981,7 +13116,7 @@
           <w:iCs/>
           <w:sz w:val="28"/>
           <w:szCs w:val="28"/>
-          <w:lang w:val="ru-RU"/>
+          <w:lang w:val="en-US"/>
         </w:rPr>
       </w:pPr>
       <w:r>
@@ -14261,9 +14396,12 @@
       </w:pPr>
     </w:p>
     <w:sectPr>
+      <w:footerReference w:type="default" r:id="rId7"/>
       <w:pgSz w:w="11906" w:h="16838"/>
       <w:pgMar w:top="1134" w:right="850" w:bottom="1134" w:left="1701" w:header="708" w:footer="708" w:gutter="0"/>
+      <w:pgNumType w:start="1"/>
       <w:cols w:space="708"/>
+      <w:titlePg/>
       <w:docGrid w:linePitch="360"/>
     </w:sectPr>
   </w:body>
@@ -14293,6 +14431,54 @@
     </w:p>
   </w:endnote>
 </w:endnotes>
+</file>
+
+<file path=word/footer1.xml><?xml version="1.0" encoding="utf-8"?>
+<w:ftr xmlns:wpc="http://schemas.microsoft.com/office/word/2010/wordprocessingCanvas" xmlns:cx="http://schemas.microsoft.com/office/drawing/2014/chartex" xmlns:cx1="http://schemas.microsoft.com/office/drawing/2015/9/8/chartex" xmlns:cx2="http://schemas.microsoft.com/office/drawing/2015/10/21/chartex" xmlns:cx3="http://schemas.microsoft.com/office/drawing/2016/5/9/chartex" xmlns:cx4="http://schemas.microsoft.com/office/drawing/2016/5/10/chartex" xmlns:cx5="http://schemas.microsoft.com/office/drawing/2016/5/11/chartex" xmlns:cx6="http://schemas.microsoft.com/office/drawing/2016/5/12/chartex" xmlns:cx7="http://schemas.microsoft.com/office/drawing/2016/5/13/chartex" xmlns:cx8="http://schemas.microsoft.com/office/drawing/2016/5/14/chartex" xmlns:mc="http://schemas.openxmlformats.org/markup-compatibility/2006" xmlns:aink="http://schemas.microsoft.com/office/drawing/2016/ink" xmlns:am3d="http://schemas.microsoft.com/office/drawing/2017/model3d" xmlns:o="urn:schemas-microsoft-com:office:office" xmlns:oel="http://schemas.microsoft.com/office/2019/extlst" xmlns:r="http://schemas.openxmlformats.org/officeDocument/2006/relationships" xmlns:m="http://schemas.openxmlformats.org/officeDocument/2006/math" xmlns:v="urn:schemas-microsoft-com:vml" xmlns:wp14="http://schemas.microsoft.com/office/word/2010/wordprocessingDrawing" xmlns:wp="http://schemas.openxmlformats.org/drawingml/2006/wordprocessingDrawing" xmlns:w10="urn:schemas-microsoft-com:office:word" xmlns:w="http://schemas.openxmlformats.org/wordprocessingml/2006/main" xmlns:w14="http://schemas.microsoft.com/office/word/2010/wordml" xmlns:w15="http://schemas.microsoft.com/office/word/2012/wordml" xmlns:w16cex="http://schemas.microsoft.com/office/word/2018/wordml/cex" xmlns:w16cid="http://schemas.microsoft.com/office/word/2016/wordml/cid" xmlns:w16="http://schemas.microsoft.com/office/word/2018/wordml" xmlns:w16du="http://schemas.microsoft.com/office/word/2023/wordml/word16du" xmlns:w16sdtdh="http://schemas.microsoft.com/office/word/2020/wordml/sdtdatahash" xmlns:w16sdtfl="http://schemas.microsoft.com/office/word/2024/wordml/sdtformatlock" xmlns:w16se="http://schemas.microsoft.com/office/word/2015/wordml/symex" xmlns:wpg="http://schemas.microsoft.com/office/word/2010/wordprocessingGroup" xmlns:wpi="http://schemas.microsoft.com/office/word/2010/wordprocessingInk" xmlns:wne="http://schemas.microsoft.com/office/word/2006/wordml" xmlns:wps="http://schemas.microsoft.com/office/word/2010/wordprocessingShape" mc:Ignorable="w14 w15 w16se w16cid w16 w16cex w16sdtdh w16sdtfl w16du wp14">
+  <w:sdt>
+    <w:sdtPr>
+      <w:id w:val="-57782830"/>
+      <w:docPartObj>
+        <w:docPartGallery w:val="Page Numbers (Bottom of Page)"/>
+        <w:docPartUnique/>
+      </w:docPartObj>
+    </w:sdtPr>
+    <w:sdtContent>
+      <w:p>
+        <w:pPr>
+          <w:pStyle w:val="af"/>
+          <w:jc w:val="center"/>
+        </w:pPr>
+        <w:r>
+          <w:fldChar w:fldCharType="begin"/>
+        </w:r>
+        <w:r>
+          <w:instrText>PAGE   \* MERGEFORMAT</w:instrText>
+        </w:r>
+        <w:r>
+          <w:fldChar w:fldCharType="separate"/>
+        </w:r>
+        <w:r>
+          <w:rPr>
+            <w:lang w:val="ru-RU"/>
+          </w:rPr>
+          <w:t>2</w:t>
+        </w:r>
+        <w:r>
+          <w:fldChar w:fldCharType="end"/>
+        </w:r>
+      </w:p>
+    </w:sdtContent>
+  </w:sdt>
+  <w:p>
+    <w:pPr>
+      <w:pStyle w:val="af"/>
+      <w:rPr>
+        <w:lang w:val="en-US"/>
+      </w:rPr>
+    </w:pPr>
+  </w:p>
+</w:ftr>
 </file>
 
 <file path=word/footnotes.xml><?xml version="1.0" encoding="utf-8"?>
@@ -14437,15 +14623,6 @@
   </w:abstractNum>
   <w:num w:numId="1" w16cid:durableId="7097924">
     <w:abstractNumId w:val="0"/>
-    <w:lvlOverride w:ilvl="0"/>
-    <w:lvlOverride w:ilvl="1"/>
-    <w:lvlOverride w:ilvl="2"/>
-    <w:lvlOverride w:ilvl="3"/>
-    <w:lvlOverride w:ilvl="4"/>
-    <w:lvlOverride w:ilvl="5"/>
-    <w:lvlOverride w:ilvl="6"/>
-    <w:lvlOverride w:ilvl="7"/>
-    <w:lvlOverride w:ilvl="8"/>
   </w:num>
 </w:numbering>
 </file>
@@ -15063,6 +15240,7 @@
   <w:style w:type="character" w:default="1" w:styleId="a0">
     <w:name w:val="Default Paragraph Font"/>
     <w:uiPriority w:val="1"/>
+    <w:semiHidden/>
     <w:unhideWhenUsed/>
   </w:style>
   <w:style w:type="table" w:default="1" w:styleId="a1">

</xml_diff>